<commit_message>
Embed capstone charts in report and notebook
</commit_message>
<xml_diff>
--- a/tasks/Data Analytics Capstone Project/outputs/osmi_mental_health_written_report_upload_ready.docx
+++ b/tasks/Data Analytics Capstone Project/outputs/osmi_mental_health_written_report_upload_ready.docx
@@ -2,7 +2,7 @@
 <file path=word/document.xml><?xml version="1.0" encoding="utf-8"?>
 <w:document xmlns:w="http://schemas.openxmlformats.org/wordprocessingml/2006/main" xmlns:m="http://schemas.openxmlformats.org/officeDocument/2006/math" xmlns:r="http://schemas.openxmlformats.org/officeDocument/2006/relationships" xmlns:o="urn:schemas-microsoft-com:office:office" xmlns:v="urn:schemas-microsoft-com:vml" xmlns:w10="urn:schemas-microsoft-com:office:word" xmlns:a="http://schemas.openxmlformats.org/drawingml/2006/main" xmlns:pic="http://schemas.openxmlformats.org/drawingml/2006/picture" xmlns:wp="http://schemas.openxmlformats.org/drawingml/2006/wordprocessingDrawing">
   <w:body>
-    <w:bookmarkStart w:id="31" w:name="X95764c9269aa36db39aea7fe97bfa9ad3991722"/>
+    <w:bookmarkStart w:id="49" w:name="X95764c9269aa36db39aea7fe97bfa9ad3991722"/>
     <w:p>
       <w:pPr>
         <w:pStyle w:val="Heading1"/>
@@ -551,7 +551,7 @@
       </w:r>
     </w:p>
     <w:bookmarkEnd w:id="16"/>
-    <w:bookmarkStart w:id="24" w:name="analysis-and-results"/>
+    <w:bookmarkStart w:id="39" w:name="analysis-and-results"/>
     <w:p>
       <w:pPr>
         <w:pStyle w:val="Heading2"/>
@@ -560,7 +560,7 @@
         <w:t xml:space="preserve">Analysis And Results</w:t>
       </w:r>
     </w:p>
-    <w:bookmarkStart w:id="17" w:name="X0b86c4bf6c8b7f59c4a6707849b377e7e69f06a"/>
+    <w:bookmarkStart w:id="20" w:name="X0b86c4bf6c8b7f59c4a6707849b377e7e69f06a"/>
     <w:p>
       <w:pPr>
         <w:pStyle w:val="Heading3"/>
@@ -593,8 +593,63 @@
         <w:t xml:space="preserve">This suggests a gap between private treatment-seeking and workplace openness.</w:t>
       </w:r>
     </w:p>
-    <w:bookmarkEnd w:id="17"/>
-    <w:bookmarkStart w:id="18" w:name="workplace-benefits-and-treatment-seeking"/>
+    <w:p>
+      <w:pPr>
+        <w:pStyle w:val="CaptionedFigure"/>
+      </w:pPr>
+      <w:r>
+        <w:drawing>
+          <wp:inline>
+            <wp:extent cx="5334000" cy="2978459"/>
+            <wp:effectExtent b="0" l="0" r="0" t="0"/>
+            <wp:docPr descr="Figure 1. Mental health treatment-seeking overview." title="" id="18" name="Picture"/>
+            <a:graphic>
+              <a:graphicData uri="http://schemas.openxmlformats.org/drawingml/2006/picture">
+                <pic:pic>
+                  <pic:nvPicPr>
+                    <pic:cNvPr descr="report_chart_assets/figure_01_treatment_overview.png" id="19" name="Picture"/>
+                    <pic:cNvPicPr>
+                      <a:picLocks noChangeArrowheads="1" noChangeAspect="1"/>
+                    </pic:cNvPicPr>
+                  </pic:nvPicPr>
+                  <pic:blipFill>
+                    <a:blip r:embed="rId17"/>
+                    <a:stretch>
+                      <a:fillRect/>
+                    </a:stretch>
+                  </pic:blipFill>
+                  <pic:spPr bwMode="auto">
+                    <a:xfrm>
+                      <a:off x="0" y="0"/>
+                      <a:ext cx="5334000" cy="2978459"/>
+                    </a:xfrm>
+                    <a:prstGeom prst="rect">
+                      <a:avLst/>
+                    </a:prstGeom>
+                    <a:noFill/>
+                    <a:ln w="9525">
+                      <a:noFill/>
+                      <a:headEnd/>
+                      <a:tailEnd/>
+                    </a:ln>
+                  </pic:spPr>
+                </pic:pic>
+              </a:graphicData>
+            </a:graphic>
+          </wp:inline>
+        </w:drawing>
+      </w:r>
+    </w:p>
+    <w:p>
+      <w:pPr>
+        <w:pStyle w:val="ImageCaption"/>
+      </w:pPr>
+      <w:r>
+        <w:t xml:space="preserve">Figure 1. Mental health treatment-seeking overview.</w:t>
+      </w:r>
+    </w:p>
+    <w:bookmarkEnd w:id="20"/>
+    <w:bookmarkStart w:id="24" w:name="workplace-benefits-and-treatment-seeking"/>
     <w:p>
       <w:pPr>
         <w:pStyle w:val="Heading3"/>
@@ -651,8 +706,63 @@
         <w:t xml:space="preserve">This supports H1.</w:t>
       </w:r>
     </w:p>
-    <w:bookmarkEnd w:id="18"/>
-    <w:bookmarkStart w:id="19" w:name="care-options-and-treatment-seeking"/>
+    <w:p>
+      <w:pPr>
+        <w:pStyle w:val="CaptionedFigure"/>
+      </w:pPr>
+      <w:r>
+        <w:drawing>
+          <wp:inline>
+            <wp:extent cx="5334000" cy="2476500"/>
+            <wp:effectExtent b="0" l="0" r="0" t="0"/>
+            <wp:docPr descr="Figure 2. Treatment-seeking by benefits awareness and care-option awareness." title="" id="22" name="Picture"/>
+            <a:graphic>
+              <a:graphicData uri="http://schemas.openxmlformats.org/drawingml/2006/picture">
+                <pic:pic>
+                  <pic:nvPicPr>
+                    <pic:cNvPr descr="report_chart_assets/figure_02_benefits_and_care_options.png" id="23" name="Picture"/>
+                    <pic:cNvPicPr>
+                      <a:picLocks noChangeArrowheads="1" noChangeAspect="1"/>
+                    </pic:cNvPicPr>
+                  </pic:nvPicPr>
+                  <pic:blipFill>
+                    <a:blip r:embed="rId21"/>
+                    <a:stretch>
+                      <a:fillRect/>
+                    </a:stretch>
+                  </pic:blipFill>
+                  <pic:spPr bwMode="auto">
+                    <a:xfrm>
+                      <a:off x="0" y="0"/>
+                      <a:ext cx="5334000" cy="2476500"/>
+                    </a:xfrm>
+                    <a:prstGeom prst="rect">
+                      <a:avLst/>
+                    </a:prstGeom>
+                    <a:noFill/>
+                    <a:ln w="9525">
+                      <a:noFill/>
+                      <a:headEnd/>
+                      <a:tailEnd/>
+                    </a:ln>
+                  </pic:spPr>
+                </pic:pic>
+              </a:graphicData>
+            </a:graphic>
+          </wp:inline>
+        </w:drawing>
+      </w:r>
+    </w:p>
+    <w:p>
+      <w:pPr>
+        <w:pStyle w:val="ImageCaption"/>
+      </w:pPr>
+      <w:r>
+        <w:t xml:space="preserve">Figure 2. Treatment-seeking by benefits awareness and care-option awareness.</w:t>
+      </w:r>
+    </w:p>
+    <w:bookmarkEnd w:id="24"/>
+    <w:bookmarkStart w:id="25" w:name="care-options-and-treatment-seeking"/>
     <w:p>
       <w:pPr>
         <w:pStyle w:val="Heading3"/>
@@ -701,8 +811,8 @@
         <w:t xml:space="preserve">p-value &lt; 0.001</w:t>
       </w:r>
     </w:p>
-    <w:bookmarkEnd w:id="19"/>
-    <w:bookmarkStart w:id="20" w:name="family-history-and-treatment-seeking"/>
+    <w:bookmarkEnd w:id="25"/>
+    <w:bookmarkStart w:id="26" w:name="family-history-and-treatment-seeking"/>
     <w:p>
       <w:pPr>
         <w:pStyle w:val="Heading3"/>
@@ -751,8 +861,8 @@
         <w:t xml:space="preserve">p-value &lt; 0.001</w:t>
       </w:r>
     </w:p>
-    <w:bookmarkEnd w:id="20"/>
-    <w:bookmarkStart w:id="21" w:name="work-interference-and-treatment-seeking"/>
+    <w:bookmarkEnd w:id="26"/>
+    <w:bookmarkStart w:id="30" w:name="work-interference-and-treatment-seeking"/>
     <w:p>
       <w:pPr>
         <w:pStyle w:val="Heading3"/>
@@ -869,8 +979,63 @@
         <w:t xml:space="preserve">This supports H3.</w:t>
       </w:r>
     </w:p>
-    <w:bookmarkEnd w:id="21"/>
-    <w:bookmarkStart w:id="22" w:name="Xcbc457df96c4747ecbe21a0d49691603d77e229"/>
+    <w:p>
+      <w:pPr>
+        <w:pStyle w:val="CaptionedFigure"/>
+      </w:pPr>
+      <w:r>
+        <w:drawing>
+          <wp:inline>
+            <wp:extent cx="5334000" cy="3142576"/>
+            <wp:effectExtent b="0" l="0" r="0" t="0"/>
+            <wp:docPr descr="Figure 3. Treatment-seeking rate by reported work interference." title="" id="28" name="Picture"/>
+            <a:graphic>
+              <a:graphicData uri="http://schemas.openxmlformats.org/drawingml/2006/picture">
+                <pic:pic>
+                  <pic:nvPicPr>
+                    <pic:cNvPr descr="report_chart_assets/figure_03_treatment_by_work_interference.png" id="29" name="Picture"/>
+                    <pic:cNvPicPr>
+                      <a:picLocks noChangeArrowheads="1" noChangeAspect="1"/>
+                    </pic:cNvPicPr>
+                  </pic:nvPicPr>
+                  <pic:blipFill>
+                    <a:blip r:embed="rId27"/>
+                    <a:stretch>
+                      <a:fillRect/>
+                    </a:stretch>
+                  </pic:blipFill>
+                  <pic:spPr bwMode="auto">
+                    <a:xfrm>
+                      <a:off x="0" y="0"/>
+                      <a:ext cx="5334000" cy="3142576"/>
+                    </a:xfrm>
+                    <a:prstGeom prst="rect">
+                      <a:avLst/>
+                    </a:prstGeom>
+                    <a:noFill/>
+                    <a:ln w="9525">
+                      <a:noFill/>
+                      <a:headEnd/>
+                      <a:tailEnd/>
+                    </a:ln>
+                  </pic:spPr>
+                </pic:pic>
+              </a:graphicData>
+            </a:graphic>
+          </wp:inline>
+        </w:drawing>
+      </w:r>
+    </w:p>
+    <w:p>
+      <w:pPr>
+        <w:pStyle w:val="ImageCaption"/>
+      </w:pPr>
+      <w:r>
+        <w:t xml:space="preserve">Figure 3. Treatment-seeking rate by reported work interference.</w:t>
+      </w:r>
+    </w:p>
+    <w:bookmarkEnd w:id="30"/>
+    <w:bookmarkStart w:id="34" w:name="Xcbc457df96c4747ecbe21a0d49691603d77e229"/>
     <w:p>
       <w:pPr>
         <w:pStyle w:val="Heading3"/>
@@ -959,8 +1124,63 @@
         <w:t xml:space="preserve">This supports H2.</w:t>
       </w:r>
     </w:p>
-    <w:bookmarkEnd w:id="22"/>
-    <w:bookmarkStart w:id="23" w:name="company-size"/>
+    <w:p>
+      <w:pPr>
+        <w:pStyle w:val="CaptionedFigure"/>
+      </w:pPr>
+      <w:r>
+        <w:drawing>
+          <wp:inline>
+            <wp:extent cx="5334000" cy="2659076"/>
+            <wp:effectExtent b="0" l="0" r="0" t="0"/>
+            <wp:docPr descr="Figure 4. Supervisor discussion comfort by expected mental health consequences." title="" id="32" name="Picture"/>
+            <a:graphic>
+              <a:graphicData uri="http://schemas.openxmlformats.org/drawingml/2006/picture">
+                <pic:pic>
+                  <pic:nvPicPr>
+                    <pic:cNvPr descr="report_chart_assets/figure_04_supervisor_comfort_by_consequence.png" id="33" name="Picture"/>
+                    <pic:cNvPicPr>
+                      <a:picLocks noChangeArrowheads="1" noChangeAspect="1"/>
+                    </pic:cNvPicPr>
+                  </pic:nvPicPr>
+                  <pic:blipFill>
+                    <a:blip r:embed="rId31"/>
+                    <a:stretch>
+                      <a:fillRect/>
+                    </a:stretch>
+                  </pic:blipFill>
+                  <pic:spPr bwMode="auto">
+                    <a:xfrm>
+                      <a:off x="0" y="0"/>
+                      <a:ext cx="5334000" cy="2659076"/>
+                    </a:xfrm>
+                    <a:prstGeom prst="rect">
+                      <a:avLst/>
+                    </a:prstGeom>
+                    <a:noFill/>
+                    <a:ln w="9525">
+                      <a:noFill/>
+                      <a:headEnd/>
+                      <a:tailEnd/>
+                    </a:ln>
+                  </pic:spPr>
+                </pic:pic>
+              </a:graphicData>
+            </a:graphic>
+          </wp:inline>
+        </w:drawing>
+      </w:r>
+    </w:p>
+    <w:p>
+      <w:pPr>
+        <w:pStyle w:val="ImageCaption"/>
+      </w:pPr>
+      <w:r>
+        <w:t xml:space="preserve">Figure 4. Supervisor discussion comfort by expected mental health consequences.</w:t>
+      </w:r>
+    </w:p>
+    <w:bookmarkEnd w:id="34"/>
+    <w:bookmarkStart w:id="38" w:name="company-size"/>
     <w:p>
       <w:pPr>
         <w:pStyle w:val="Heading3"/>
@@ -1041,9 +1261,64 @@
         <w:t xml:space="preserve">This partially supports H4.</w:t>
       </w:r>
     </w:p>
-    <w:bookmarkEnd w:id="23"/>
-    <w:bookmarkEnd w:id="24"/>
-    <w:bookmarkStart w:id="25" w:name="logistic-regression-model"/>
+    <w:p>
+      <w:pPr>
+        <w:pStyle w:val="CaptionedFigure"/>
+      </w:pPr>
+      <w:r>
+        <w:drawing>
+          <wp:inline>
+            <wp:extent cx="5334000" cy="3180047"/>
+            <wp:effectExtent b="0" l="0" r="0" t="0"/>
+            <wp:docPr descr="Figure 5. Treatment-seeking rate by company size." title="" id="36" name="Picture"/>
+            <a:graphic>
+              <a:graphicData uri="http://schemas.openxmlformats.org/drawingml/2006/picture">
+                <pic:pic>
+                  <pic:nvPicPr>
+                    <pic:cNvPr descr="report_chart_assets/figure_05_treatment_by_company_size.png" id="37" name="Picture"/>
+                    <pic:cNvPicPr>
+                      <a:picLocks noChangeArrowheads="1" noChangeAspect="1"/>
+                    </pic:cNvPicPr>
+                  </pic:nvPicPr>
+                  <pic:blipFill>
+                    <a:blip r:embed="rId35"/>
+                    <a:stretch>
+                      <a:fillRect/>
+                    </a:stretch>
+                  </pic:blipFill>
+                  <pic:spPr bwMode="auto">
+                    <a:xfrm>
+                      <a:off x="0" y="0"/>
+                      <a:ext cx="5334000" cy="3180047"/>
+                    </a:xfrm>
+                    <a:prstGeom prst="rect">
+                      <a:avLst/>
+                    </a:prstGeom>
+                    <a:noFill/>
+                    <a:ln w="9525">
+                      <a:noFill/>
+                      <a:headEnd/>
+                      <a:tailEnd/>
+                    </a:ln>
+                  </pic:spPr>
+                </pic:pic>
+              </a:graphicData>
+            </a:graphic>
+          </wp:inline>
+        </w:drawing>
+      </w:r>
+    </w:p>
+    <w:p>
+      <w:pPr>
+        <w:pStyle w:val="ImageCaption"/>
+      </w:pPr>
+      <w:r>
+        <w:t xml:space="preserve">Figure 5. Treatment-seeking rate by company size.</w:t>
+      </w:r>
+    </w:p>
+    <w:bookmarkEnd w:id="38"/>
+    <w:bookmarkEnd w:id="39"/>
+    <w:bookmarkStart w:id="43" w:name="logistic-regression-model"/>
     <w:p>
       <w:pPr>
         <w:pStyle w:val="Heading2"/>
@@ -1252,14 +1527,69 @@
         <w:t xml:space="preserve">The model confirms that work interference, personal context, and workplace support variables are strongly associated with treatment-seeking. However, the model should not be interpreted causally.</w:t>
       </w:r>
     </w:p>
-    <w:bookmarkEnd w:id="25"/>
-    <w:bookmarkStart w:id="26" w:name="dashboard-summary"/>
+    <w:p>
+      <w:pPr>
+        <w:pStyle w:val="CaptionedFigure"/>
+      </w:pPr>
+      <w:r>
+        <w:drawing>
+          <wp:inline>
+            <wp:extent cx="5334000" cy="3162450"/>
+            <wp:effectExtent b="0" l="0" r="0" t="0"/>
+            <wp:docPr descr="Figure 6. Logistic regression model performance." title="" id="41" name="Picture"/>
+            <a:graphic>
+              <a:graphicData uri="http://schemas.openxmlformats.org/drawingml/2006/picture">
+                <pic:pic>
+                  <pic:nvPicPr>
+                    <pic:cNvPr descr="report_chart_assets/figure_06_model_performance.png" id="42" name="Picture"/>
+                    <pic:cNvPicPr>
+                      <a:picLocks noChangeArrowheads="1" noChangeAspect="1"/>
+                    </pic:cNvPicPr>
+                  </pic:nvPicPr>
+                  <pic:blipFill>
+                    <a:blip r:embed="rId40"/>
+                    <a:stretch>
+                      <a:fillRect/>
+                    </a:stretch>
+                  </pic:blipFill>
+                  <pic:spPr bwMode="auto">
+                    <a:xfrm>
+                      <a:off x="0" y="0"/>
+                      <a:ext cx="5334000" cy="3162450"/>
+                    </a:xfrm>
+                    <a:prstGeom prst="rect">
+                      <a:avLst/>
+                    </a:prstGeom>
+                    <a:noFill/>
+                    <a:ln w="9525">
+                      <a:noFill/>
+                      <a:headEnd/>
+                      <a:tailEnd/>
+                    </a:ln>
+                  </pic:spPr>
+                </pic:pic>
+              </a:graphicData>
+            </a:graphic>
+          </wp:inline>
+        </w:drawing>
+      </w:r>
+    </w:p>
+    <w:p>
+      <w:pPr>
+        <w:pStyle w:val="ImageCaption"/>
+      </w:pPr>
+      <w:r>
+        <w:t xml:space="preserve">Figure 6. Logistic regression model performance.</w:t>
+      </w:r>
+    </w:p>
+    <w:bookmarkEnd w:id="43"/>
+    <w:bookmarkStart w:id="44" w:name="dashboard-and-notebook-summary"/>
     <w:p>
       <w:pPr>
         <w:pStyle w:val="Heading2"/>
       </w:pPr>
       <w:r>
-        <w:t xml:space="preserve">Dashboard Summary</w:t>
+        <w:t xml:space="preserve">Dashboard And Notebook Summary</w:t>
       </w:r>
     </w:p>
     <w:p>
@@ -1267,7 +1597,7 @@
         <w:pStyle w:val="FirstParagraph"/>
       </w:pPr>
       <w:r>
-        <w:t xml:space="preserve">The dashboard presents the same story visually. It includes:</w:t>
+        <w:t xml:space="preserve">The visual dashboard story is presented in the notebook and written report using the same chart snippets. A supplementary standalone HTML dashboard is also saved in the project folder. Together, these visual artifacts include:</w:t>
       </w:r>
     </w:p>
     <w:p>
@@ -1359,7 +1689,26 @@
         <w:pStyle w:val="FirstParagraph"/>
       </w:pPr>
       <w:r>
-        <w:t xml:space="preserve">The dashboard file is saved as:</w:t>
+        <w:t xml:space="preserve">The main notebook file is saved as:</w:t>
+      </w:r>
+    </w:p>
+    <w:p>
+      <w:pPr>
+        <w:pStyle w:val="BodyText"/>
+      </w:pPr>
+      <w:r>
+        <w:rPr>
+          <w:rStyle w:val="VerbatimChar"/>
+        </w:rPr>
+        <w:t xml:space="preserve">notebooks/osmi_mental_health_analysis.ipynb</w:t>
+      </w:r>
+    </w:p>
+    <w:p>
+      <w:pPr>
+        <w:pStyle w:val="BodyText"/>
+      </w:pPr>
+      <w:r>
+        <w:t xml:space="preserve">The supplementary standalone HTML dashboard file is saved as:</w:t>
       </w:r>
     </w:p>
     <w:p>
@@ -1373,8 +1722,8 @@
         <w:t xml:space="preserve">outputs/dashboard/osmi_mental_health_dashboard.html</w:t>
       </w:r>
     </w:p>
-    <w:bookmarkEnd w:id="26"/>
-    <w:bookmarkStart w:id="27" w:name="recommendations"/>
+    <w:bookmarkEnd w:id="44"/>
+    <w:bookmarkStart w:id="45" w:name="recommendations"/>
     <w:p>
       <w:pPr>
         <w:pStyle w:val="Heading2"/>
@@ -1423,8 +1772,8 @@
         <w:t xml:space="preserve">Employers should monitor work interference as a warning signal. Respondents reporting work interference had much higher treatment-seeking rates, especially those reporting that mental health often interfered with work.</w:t>
       </w:r>
     </w:p>
-    <w:bookmarkEnd w:id="27"/>
-    <w:bookmarkStart w:id="28" w:name="limitations"/>
+    <w:bookmarkEnd w:id="45"/>
+    <w:bookmarkStart w:id="46" w:name="limitations"/>
     <w:p>
       <w:pPr>
         <w:pStyle w:val="Heading2"/>
@@ -1481,8 +1830,8 @@
         <w:t xml:space="preserve">The dataset is from one public Kaggle source, so the findings should be generalized carefully.</w:t>
       </w:r>
     </w:p>
-    <w:bookmarkEnd w:id="28"/>
-    <w:bookmarkStart w:id="29" w:name="conclusion"/>
+    <w:bookmarkEnd w:id="46"/>
+    <w:bookmarkStart w:id="47" w:name="conclusion"/>
     <w:p>
       <w:pPr>
         <w:pStyle w:val="Heading2"/>
@@ -1507,8 +1856,8 @@
         <w:t xml:space="preserve">The strongest evidence points to the importance of workplace support, benefit awareness, care options, perceived consequences, and work interference. The findings suggest that organizations should not only offer mental health resources, but also make them visible, confidential, and culturally safe to use.</w:t>
       </w:r>
     </w:p>
-    <w:bookmarkEnd w:id="29"/>
-    <w:bookmarkStart w:id="30" w:name="references"/>
+    <w:bookmarkEnd w:id="47"/>
+    <w:bookmarkStart w:id="48" w:name="references"/>
     <w:p>
       <w:pPr>
         <w:pStyle w:val="Heading2"/>
@@ -1541,8 +1890,8 @@
         <w:t xml:space="preserve">Grammarly. How to write a report. https://www.grammarly.com/blog/academic-writing/how-to-write-a-report/</w:t>
       </w:r>
     </w:p>
-    <w:bookmarkEnd w:id="30"/>
-    <w:bookmarkEnd w:id="31"/>
+    <w:bookmarkEnd w:id="48"/>
+    <w:bookmarkEnd w:id="49"/>
     <w:sectPr>
       <w:footnotePr>
         <w:numRestart w:val="eachSect"/>

</xml_diff>

<commit_message>
Fix capstone company size labels
</commit_message>
<xml_diff>
--- a/tasks/Data Analytics Capstone Project/outputs/osmi_mental_health_written_report_upload_ready.docx
+++ b/tasks/Data Analytics Capstone Project/outputs/osmi_mental_health_written_report_upload_ready.docx
@@ -2,12 +2,47 @@
 <file path=word/document.xml><?xml version="1.0" encoding="utf-8"?>
 <w:document xmlns:w="http://schemas.openxmlformats.org/wordprocessingml/2006/main" xmlns:m="http://schemas.openxmlformats.org/officeDocument/2006/math" xmlns:r="http://schemas.openxmlformats.org/officeDocument/2006/relationships" xmlns:o="urn:schemas-microsoft-com:office:office" xmlns:v="urn:schemas-microsoft-com:vml" xmlns:w10="urn:schemas-microsoft-com:office:word" xmlns:a="http://schemas.openxmlformats.org/drawingml/2006/main" xmlns:pic="http://schemas.openxmlformats.org/drawingml/2006/picture" xmlns:wp="http://schemas.openxmlformats.org/drawingml/2006/wordprocessingDrawing">
   <w:body>
+    <w:sdt>
+      <w:sdtPr>
+        <w:docPartObj>
+          <w:docPartGallery w:val="Table of Contents"/>
+          <w:docPartUnique/>
+        </w:docPartObj>
+      </w:sdtPr>
+      <w:sdtContent>
+        <w:p>
+          <w:pPr>
+            <w:pStyle w:val="TOCHeading"/>
+          </w:pPr>
+          <w:r>
+            <w:t xml:space="preserve">Table of Contents</w:t>
+          </w:r>
+        </w:p>
+        <w:p>
+          <w:r>
+            <w:fldChar w:fldCharType="begin" w:dirty="true"/>
+            <w:instrText xml:space="preserve">TOC \o "1-3" \h \z \u</w:instrText>
+            <w:fldChar w:fldCharType="separate"/>
+            <w:fldChar w:fldCharType="end"/>
+          </w:r>
+        </w:p>
+      </w:sdtContent>
+    </w:sdt>
     <w:bookmarkStart w:id="49" w:name="X95764c9269aa36db39aea7fe97bfa9ad3991722"/>
     <w:p>
       <w:pPr>
         <w:pStyle w:val="Heading1"/>
       </w:pPr>
       <w:r>
+        <w:rPr>
+          <w:rStyle w:val="SectionNumber"/>
+        </w:rPr>
+        <w:t xml:space="preserve">1</w:t>
+      </w:r>
+      <w:r>
+        <w:tab/>
+      </w:r>
+      <w:r>
         <w:t xml:space="preserve">Workplace Mental Health Disclosure And Support In The Technology Sector</w:t>
       </w:r>
     </w:p>
@@ -16,6 +51,15 @@
       <w:pPr>
         <w:pStyle w:val="Heading2"/>
       </w:pPr>
+      <w:r>
+        <w:rPr>
+          <w:rStyle w:val="SectionNumber"/>
+        </w:rPr>
+        <w:t xml:space="preserve">1.1</w:t>
+      </w:r>
+      <w:r>
+        <w:tab/>
+      </w:r>
       <w:r>
         <w:t xml:space="preserve">Executive Summary</w:t>
       </w:r>
@@ -59,6 +103,15 @@
         <w:pStyle w:val="Heading2"/>
       </w:pPr>
       <w:r>
+        <w:rPr>
+          <w:rStyle w:val="SectionNumber"/>
+        </w:rPr>
+        <w:t xml:space="preserve">1.2</w:t>
+      </w:r>
+      <w:r>
+        <w:tab/>
+      </w:r>
+      <w:r>
         <w:t xml:space="preserve">Introduction</w:t>
       </w:r>
     </w:p>
@@ -85,6 +138,15 @@
         <w:pStyle w:val="Heading2"/>
       </w:pPr>
       <w:r>
+        <w:rPr>
+          <w:rStyle w:val="SectionNumber"/>
+        </w:rPr>
+        <w:t xml:space="preserve">1.3</w:t>
+      </w:r>
+      <w:r>
+        <w:tab/>
+      </w:r>
+      <w:r>
         <w:t xml:space="preserve">Data Source And Context</w:t>
       </w:r>
     </w:p>
@@ -295,6 +357,15 @@
         <w:pStyle w:val="Heading2"/>
       </w:pPr>
       <w:r>
+        <w:rPr>
+          <w:rStyle w:val="SectionNumber"/>
+        </w:rPr>
+        <w:t xml:space="preserve">1.4</w:t>
+      </w:r>
+      <w:r>
+        <w:tab/>
+      </w:r>
+      <w:r>
         <w:t xml:space="preserve">Target Audience</w:t>
       </w:r>
     </w:p>
@@ -313,6 +384,15 @@
         <w:pStyle w:val="Heading2"/>
       </w:pPr>
       <w:r>
+        <w:rPr>
+          <w:rStyle w:val="SectionNumber"/>
+        </w:rPr>
+        <w:t xml:space="preserve">1.5</w:t>
+      </w:r>
+      <w:r>
+        <w:tab/>
+      </w:r>
+      <w:r>
         <w:t xml:space="preserve">Research Question</w:t>
       </w:r>
     </w:p>
@@ -331,6 +411,15 @@
         <w:pStyle w:val="Heading2"/>
       </w:pPr>
       <w:r>
+        <w:rPr>
+          <w:rStyle w:val="SectionNumber"/>
+        </w:rPr>
+        <w:t xml:space="preserve">1.6</w:t>
+      </w:r>
+      <w:r>
+        <w:tab/>
+      </w:r>
+      <w:r>
         <w:t xml:space="preserve">Hypotheses</w:t>
       </w:r>
     </w:p>
@@ -373,6 +462,15 @@
         <w:pStyle w:val="Heading2"/>
       </w:pPr>
       <w:r>
+        <w:rPr>
+          <w:rStyle w:val="SectionNumber"/>
+        </w:rPr>
+        <w:t xml:space="preserve">1.7</w:t>
+      </w:r>
+      <w:r>
+        <w:tab/>
+      </w:r>
+      <w:r>
         <w:t xml:space="preserve">Methodology</w:t>
       </w:r>
     </w:p>
@@ -415,6 +513,15 @@
         <w:pStyle w:val="Heading2"/>
       </w:pPr>
       <w:r>
+        <w:rPr>
+          <w:rStyle w:val="SectionNumber"/>
+        </w:rPr>
+        <w:t xml:space="preserve">1.8</w:t>
+      </w:r>
+      <w:r>
+        <w:tab/>
+      </w:r>
+      <w:r>
         <w:t xml:space="preserve">Data Preparation</w:t>
       </w:r>
     </w:p>
@@ -439,7 +546,7 @@
         <w:pStyle w:val="BodyText"/>
       </w:pPr>
       <w:r>
-        <w:t xml:space="preserve">The cleaned dataset contains 1,259 rows and 56 columns. New variables were created for analysis, including:</w:t>
+        <w:t xml:space="preserve">The cleaned dataset contains 1,259 rows and 57 columns. New variables were created for analysis, including:</w:t>
       </w:r>
     </w:p>
     <w:p>
@@ -557,6 +664,15 @@
         <w:pStyle w:val="Heading2"/>
       </w:pPr>
       <w:r>
+        <w:rPr>
+          <w:rStyle w:val="SectionNumber"/>
+        </w:rPr>
+        <w:t xml:space="preserve">1.9</w:t>
+      </w:r>
+      <w:r>
+        <w:tab/>
+      </w:r>
+      <w:r>
         <w:t xml:space="preserve">Analysis And Results</w:t>
       </w:r>
     </w:p>
@@ -565,6 +681,15 @@
       <w:pPr>
         <w:pStyle w:val="Heading3"/>
       </w:pPr>
+      <w:r>
+        <w:rPr>
+          <w:rStyle w:val="SectionNumber"/>
+        </w:rPr>
+        <w:t xml:space="preserve">1.9.1</w:t>
+      </w:r>
+      <w:r>
+        <w:tab/>
+      </w:r>
       <w:r>
         <w:t xml:space="preserve">Overall Treatment And Disclosure Patterns</w:t>
       </w:r>
@@ -655,6 +780,15 @@
         <w:pStyle w:val="Heading3"/>
       </w:pPr>
       <w:r>
+        <w:rPr>
+          <w:rStyle w:val="SectionNumber"/>
+        </w:rPr>
+        <w:t xml:space="preserve">1.9.2</w:t>
+      </w:r>
+      <w:r>
+        <w:tab/>
+      </w:r>
+      <w:r>
         <w:t xml:space="preserve">Workplace Benefits And Treatment-Seeking</w:t>
       </w:r>
     </w:p>
@@ -768,6 +902,15 @@
         <w:pStyle w:val="Heading3"/>
       </w:pPr>
       <w:r>
+        <w:rPr>
+          <w:rStyle w:val="SectionNumber"/>
+        </w:rPr>
+        <w:t xml:space="preserve">1.9.3</w:t>
+      </w:r>
+      <w:r>
+        <w:tab/>
+      </w:r>
+      <w:r>
         <w:t xml:space="preserve">Care Options And Treatment-Seeking</w:t>
       </w:r>
     </w:p>
@@ -818,6 +961,15 @@
         <w:pStyle w:val="Heading3"/>
       </w:pPr>
       <w:r>
+        <w:rPr>
+          <w:rStyle w:val="SectionNumber"/>
+        </w:rPr>
+        <w:t xml:space="preserve">1.9.4</w:t>
+      </w:r>
+      <w:r>
+        <w:tab/>
+      </w:r>
+      <w:r>
         <w:t xml:space="preserve">Family History And Treatment-Seeking</w:t>
       </w:r>
     </w:p>
@@ -867,6 +1019,15 @@
       <w:pPr>
         <w:pStyle w:val="Heading3"/>
       </w:pPr>
+      <w:r>
+        <w:rPr>
+          <w:rStyle w:val="SectionNumber"/>
+        </w:rPr>
+        <w:t xml:space="preserve">1.9.5</w:t>
+      </w:r>
+      <w:r>
+        <w:tab/>
+      </w:r>
       <w:r>
         <w:t xml:space="preserve">Work Interference And Treatment-Seeking</w:t>
       </w:r>
@@ -1041,6 +1202,15 @@
         <w:pStyle w:val="Heading3"/>
       </w:pPr>
       <w:r>
+        <w:rPr>
+          <w:rStyle w:val="SectionNumber"/>
+        </w:rPr>
+        <w:t xml:space="preserve">1.9.6</w:t>
+      </w:r>
+      <w:r>
+        <w:tab/>
+      </w:r>
+      <w:r>
         <w:t xml:space="preserve">Perceived Consequences And Disclosure Comfort</w:t>
       </w:r>
     </w:p>
@@ -1186,6 +1356,15 @@
         <w:pStyle w:val="Heading3"/>
       </w:pPr>
       <w:r>
+        <w:rPr>
+          <w:rStyle w:val="SectionNumber"/>
+        </w:rPr>
+        <w:t xml:space="preserve">1.9.7</w:t>
+      </w:r>
+      <w:r>
+        <w:tab/>
+      </w:r>
+      <w:r>
         <w:t xml:space="preserve">Company Size</w:t>
       </w:r>
     </w:p>
@@ -1268,7 +1447,7 @@
       <w:r>
         <w:drawing>
           <wp:inline>
-            <wp:extent cx="5334000" cy="3180047"/>
+            <wp:extent cx="5334000" cy="3434451"/>
             <wp:effectExtent b="0" l="0" r="0" t="0"/>
             <wp:docPr descr="Figure 5. Treatment-seeking rate by company size." title="" id="36" name="Picture"/>
             <a:graphic>
@@ -1289,7 +1468,7 @@
                   <pic:spPr bwMode="auto">
                     <a:xfrm>
                       <a:off x="0" y="0"/>
-                      <a:ext cx="5334000" cy="3180047"/>
+                      <a:ext cx="5334000" cy="3434451"/>
                     </a:xfrm>
                     <a:prstGeom prst="rect">
                       <a:avLst/>
@@ -1323,6 +1502,15 @@
       <w:pPr>
         <w:pStyle w:val="Heading2"/>
       </w:pPr>
+      <w:r>
+        <w:rPr>
+          <w:rStyle w:val="SectionNumber"/>
+        </w:rPr>
+        <w:t xml:space="preserve">1.10</w:t>
+      </w:r>
+      <w:r>
+        <w:tab/>
+      </w:r>
       <w:r>
         <w:t xml:space="preserve">Logistic Regression Model</w:t>
       </w:r>
@@ -1589,6 +1777,15 @@
         <w:pStyle w:val="Heading2"/>
       </w:pPr>
       <w:r>
+        <w:rPr>
+          <w:rStyle w:val="SectionNumber"/>
+        </w:rPr>
+        <w:t xml:space="preserve">1.11</w:t>
+      </w:r>
+      <w:r>
+        <w:tab/>
+      </w:r>
+      <w:r>
         <w:t xml:space="preserve">Dashboard And Notebook Summary</w:t>
       </w:r>
     </w:p>
@@ -1729,6 +1926,15 @@
         <w:pStyle w:val="Heading2"/>
       </w:pPr>
       <w:r>
+        <w:rPr>
+          <w:rStyle w:val="SectionNumber"/>
+        </w:rPr>
+        <w:t xml:space="preserve">1.12</w:t>
+      </w:r>
+      <w:r>
+        <w:tab/>
+      </w:r>
+      <w:r>
         <w:t xml:space="preserve">Recommendations</w:t>
       </w:r>
     </w:p>
@@ -1779,6 +1985,15 @@
         <w:pStyle w:val="Heading2"/>
       </w:pPr>
       <w:r>
+        <w:rPr>
+          <w:rStyle w:val="SectionNumber"/>
+        </w:rPr>
+        <w:t xml:space="preserve">1.13</w:t>
+      </w:r>
+      <w:r>
+        <w:tab/>
+      </w:r>
+      <w:r>
         <w:t xml:space="preserve">Limitations</w:t>
       </w:r>
     </w:p>
@@ -1837,6 +2052,15 @@
         <w:pStyle w:val="Heading2"/>
       </w:pPr>
       <w:r>
+        <w:rPr>
+          <w:rStyle w:val="SectionNumber"/>
+        </w:rPr>
+        <w:t xml:space="preserve">1.14</w:t>
+      </w:r>
+      <w:r>
+        <w:tab/>
+      </w:r>
+      <w:r>
         <w:t xml:space="preserve">Conclusion</w:t>
       </w:r>
     </w:p>
@@ -1862,6 +2086,15 @@
       <w:pPr>
         <w:pStyle w:val="Heading2"/>
       </w:pPr>
+      <w:r>
+        <w:rPr>
+          <w:rStyle w:val="SectionNumber"/>
+        </w:rPr>
+        <w:t xml:space="preserve">1.15</w:t>
+      </w:r>
+      <w:r>
+        <w:tab/>
+      </w:r>
       <w:r>
         <w:t xml:space="preserve">References</w:t>
       </w:r>

</xml_diff>